<commit_message>
Declare this the audit paper; resume the sweep as a separate study
Adds an explicit Scope paragraph to the Introduction. The reviewer was right
that two different studies were being conflated: this paper is a
reproducibility and per-field reliability audit of a published benchmark, and
the question of how temporal and multi-sensor benefits scale with the number
of independent training plots is a separate study requiring the data-regime
sweep. The Scope paragraph states that the sweep is not addressed here, that
the ablation is used to characterise sensitivity at full data rather than to
answer the scaling question, and that the two sets of results are not
combined.

The sweep is resumed as the second study: 90 runs over 6 plot counts x 3
configs x 5 seeds, using the clean v2_radar config so the three curves differ
by one factor each. It correctly skipped the 17 banked runs on restart.

3,341 words, 6 figures.

Co-Authored-By: Claude Opus 5 <noreply@anthropic.com>
</commit_message>
<xml_diff>
--- a/docs/SICKLE_Field_Level_Audit.docx
+++ b/docs/SICKLE_Field_Level_Audit.docx
@@ -97,6 +97,15 @@
       </w:pPr>
       <w:r>
         <w:t>A village-level estimate is nevertheless assembled from predictions over the individual fields it contains. If a model errs systematically on a subset of those fields, the errors do not cancel in the aggregate; they bias it. Validation against a handful of crop cuttings at village level cannot detect this. The quantity that is never measured is the one on which three farmer-facing decisions depend: a field’s yield for an insurance payout, a field’s harvest date for procurement scheduling, and a field’s transplanting date for irrigation timing.</w:t>
+      </w:r>
+    </w:p>
+    <w:p>
+      <w:pPr>
+        <w:spacing w:after="120"/>
+        <w:jc w:val="both"/>
+      </w:pPr>
+      <w:r>
+        <w:t>Scope. This paper reports a reproducibility and per-field reliability audit of a published benchmark. It is deliberately distinct from a second study, in progress, which asks how the benefit of temporal and multi-sensor modelling scales with the number of independent training plots; that question requires a data-regime sweep over nested plot subsets and is not addressed here. The ablation of Section III-C is used in this paper to characterise the benchmark’s sensitivity to modelling choices at full data, not to answer the scaling question, and the two sets of results are not combined.</w:t>
       </w:r>
     </w:p>
     <w:p>

</xml_diff>